<commit_message>
vault backup: 2026-09-14 15:04:27
</commit_message>
<xml_diff>
--- a/工作/圈式链式/关于“链上红盟·三联共促”党建联建近期工作推进情况的汇报（提纲）修改版.docx
+++ b/工作/圈式链式/关于“链上红盟·三联共促”党建联建近期工作推进情况的汇报（提纲）修改版.docx
@@ -12,6 +12,10 @@
         <w:jc w:val="center"/>
         <w:outlineLvl w:val="0"/>
         <w:rPr>
+          <w:rFonts w:hint="eastAsia" w:ascii="方正小标宋简体" w:hAnsi="方正小标宋简体" w:eastAsia="方正小标宋简体" w:cs="方正小标宋简体"/>
+          <w:b/>
+          <w:bCs/>
+          <w:color w:val="000000"/>
           <w:sz w:val="44"/>
           <w:szCs w:val="44"/>
         </w:rPr>
@@ -19,16 +23,72 @@
       <w:r>
         <w:rPr>
           <w:rFonts w:hint="eastAsia" w:ascii="方正小标宋简体" w:hAnsi="方正小标宋简体" w:eastAsia="方正小标宋简体" w:cs="方正小标宋简体"/>
-          <w:b w:val="0"/>
+          <w:b/>
+          <w:bCs/>
           <w:color w:val="000000"/>
           <w:sz w:val="44"/>
         </w:rPr>
-        <w:t xml:space="preserve">关于“链上红盟·三联共促”</w:t>
+        <w:t xml:space="preserve">关</w:t>
       </w:r>
       <w:r>
         <w:rPr>
           <w:rFonts w:hint="eastAsia" w:ascii="方正小标宋简体" w:hAnsi="方正小标宋简体" w:eastAsia="方正小标宋简体" w:cs="方正小标宋简体"/>
-          <w:b w:val="0"/>
+          <w:b/>
+          <w:bCs/>
+          <w:color w:val="000000"/>
+          <w:sz w:val="44"/>
+        </w:rPr>
+        <w:t xml:space="preserve">于“链上红盟·三联共促”</w:t>
+      </w:r>
+      <w:r>
+        <w:rPr>
+          <w:b/>
+          <w:bCs/>
+          <w:sz w:val="44"/>
+          <w:szCs w:val="44"/>
+        </w:rPr>
+      </w:r>
+    </w:p>
+    <w:p>
+      <w:pPr>
+        <w:keepNext w:val="true"/>
+        <w:keepLines w:val="true"/>
+        <w:pBdr/>
+        <w:spacing w:after="0" w:afterAutospacing="1" w:before="0" w:beforeAutospacing="1" w:line="560" w:lineRule="exact"/>
+        <w:ind w:firstLine="0"/>
+        <w:jc w:val="center"/>
+        <w:outlineLvl w:val="0"/>
+        <w:rPr>
+          <w:b/>
+          <w:bCs/>
+          <w:sz w:val="44"/>
+          <w:szCs w:val="44"/>
+        </w:rPr>
+      </w:pPr>
+      <w:r>
+        <w:rPr>
+          <w:rFonts w:hint="eastAsia" w:ascii="方正小标宋简体" w:hAnsi="方正小标宋简体" w:eastAsia="方正小标宋简体" w:cs="方正小标宋简体"/>
+          <w:b/>
+          <w:bCs/>
+          <w:color w:val="000000"/>
+          <w:sz w:val="44"/>
+        </w:rPr>
+      </w:r>
+      <w:r>
+        <w:rPr>
+          <w:rFonts w:hint="eastAsia" w:ascii="方正小标宋简体" w:hAnsi="方正小标宋简体" w:eastAsia="方正小标宋简体" w:cs="方正小标宋简体"/>
+          <w:b/>
+          <w:bCs/>
+          <w:color w:val="000000"/>
+          <w:sz w:val="44"/>
+        </w:rPr>
+        <w:t xml:space="preserve">智慧</w:t>
+      </w:r>
+      <w:r>
+        <w:rPr>
+          <w:rFonts w:hint="eastAsia" w:ascii="方正小标宋简体" w:hAnsi="方正小标宋简体" w:eastAsia="方正小标宋简体" w:cs="方正小标宋简体"/>
+          <w:b/>
+          <w:bCs/>
           <w:color w:val="000000"/>
           <w:sz w:val="44"/>
         </w:rPr>
@@ -37,7 +97,8 @@
       <w:r>
         <w:rPr>
           <w:rFonts w:hint="eastAsia" w:ascii="方正小标宋简体" w:hAnsi="方正小标宋简体" w:eastAsia="方正小标宋简体" w:cs="方正小标宋简体"/>
-          <w:b w:val="0"/>
+          <w:b/>
+          <w:bCs/>
           <w:color w:val="000000"/>
           <w:sz w:val="44"/>
         </w:rPr>
@@ -45,8 +106,16 @@
       </w:r>
       <w:r>
         <w:rPr>
+          <w:b/>
+          <w:bCs/>
           <w:sz w:val="44"/>
           <w:szCs w:val="44"/>
+        </w:rPr>
+      </w:r>
+      <w:r>
+        <w:rPr>
+          <w:b/>
+          <w:bCs/>
         </w:rPr>
       </w:r>
     </w:p>
@@ -172,6 +241,16 @@
           <w:szCs w:val="32"/>
         </w:rPr>
       </w:pPr>
+      <w:r>
+        <w:rPr>
+          <w:rFonts w:hint="eastAsia" w:ascii="楷体_GB2312" w:hAnsi="楷体_GB2312" w:eastAsia="楷体_GB2312" w:cs="楷体_GB2312"/>
+          <w:b w:val="0"/>
+          <w:color w:val="000000"/>
+          <w:sz w:val="32"/>
+          <w:lang w:val="zh-CN"/>
+        </w:rPr>
+        <w:t xml:space="preserve">    </w:t>
+      </w:r>
       <w:r>
         <w:rPr>
           <w:rFonts w:hint="eastAsia" w:ascii="楷体_GB2312" w:hAnsi="楷体_GB2312" w:eastAsia="楷体_GB2312" w:cs="楷体_GB2312"/>
@@ -827,7 +906,98 @@
         <w:rPr>
           <w:rFonts w:hint="eastAsia"/>
         </w:rPr>
-        <w:t xml:space="preserve">联动属地单位、周边园区已开展摄影展、交友等圈层交流活动2场，覆盖园区及周边企业员工超百人次，以文化浸润增进企业与园区的黏性。立足10月20日集团党建联建暨产业链对接推进会承办任务，初步设想以企业产品推介会为载体，组织链核企业、生态伙伴现场展示产品和技术，同步开展需求对接、资源推介，推动圈层活动与产业招引、企业服务有效贯通。</w:t>
+        <w:t xml:space="preserve">策划</w:t>
+      </w:r>
+      <w:r>
+        <w:rPr>
+          <w:rFonts w:hint="eastAsia"/>
+        </w:rPr>
+        <w:t xml:space="preserve">并</w:t>
+      </w:r>
+      <w:r>
+        <w:rPr>
+          <w:rFonts w:hint="eastAsia"/>
+        </w:rPr>
+        <w:t xml:space="preserve">实施</w:t>
+      </w:r>
+      <w:r>
+        <w:rPr>
+          <w:rFonts w:hint="eastAsia"/>
+        </w:rPr>
+        <w:t xml:space="preserve">杭州</w:t>
+      </w:r>
+      <w:r>
+        <w:rPr>
+          <w:rFonts w:hint="eastAsia"/>
+        </w:rPr>
+        <w:t xml:space="preserve">交</w:t>
+      </w:r>
+      <w:r>
+        <w:rPr>
+          <w:rFonts w:hint="eastAsia"/>
+        </w:rPr>
+        <w:t xml:space="preserve">投</w:t>
+      </w:r>
+      <w:r>
+        <w:rPr>
+          <w:rFonts w:hint="eastAsia"/>
+        </w:rPr>
+        <w:t xml:space="preserve">科</w:t>
+      </w:r>
+      <w:r>
+        <w:rPr>
+          <w:rFonts w:hint="eastAsia"/>
+        </w:rPr>
+        <w:t xml:space="preserve">创</w:t>
+      </w:r>
+      <w:r>
+        <w:rPr>
+          <w:rFonts w:hint="eastAsia"/>
+        </w:rPr>
+        <w:t xml:space="preserve">中</w:t>
+      </w:r>
+      <w:r>
+        <w:rPr>
+          <w:rFonts w:hint="eastAsia"/>
+        </w:rPr>
+        <w:t xml:space="preserve">心</w:t>
+      </w:r>
+      <w:r>
+        <w:rPr>
+          <w:rFonts w:hint="eastAsia"/>
+          <w:lang w:val="zh-CN"/>
+        </w:rPr>
+        <w:t xml:space="preserve">****</w:t>
+      </w:r>
+      <w:r>
+        <w:rPr>
+          <w:rFonts w:hint="eastAsia"/>
+        </w:rPr>
+        <w:t xml:space="preserve">摄影展、交友等圈层交流活动</w:t>
+      </w:r>
+      <w:r>
+        <w:rPr>
+          <w:rFonts w:hint="eastAsia"/>
+          <w:lang w:val="zh-CN"/>
+        </w:rPr>
+        <w:t xml:space="preserve">1</w:t>
+      </w:r>
+      <w:r>
+        <w:rPr>
+          <w:rFonts w:hint="eastAsia"/>
+        </w:rPr>
+        <w:t xml:space="preserve">场，覆盖园区</w:t>
+      </w:r>
+      <w:r>
+        <w:rPr>
+          <w:rFonts w:hint="eastAsia"/>
+        </w:rPr>
+      </w:r>
+      <w:r>
+        <w:rPr>
+          <w:rFonts w:hint="eastAsia"/>
+        </w:rPr>
+        <w:t xml:space="preserve">企业员工超百人次，以文化浸润增进企业与园区的黏性。立足10月20日集团党建联建暨产业链对接推进会承办任务，初步设想以企业产品推介会为载体，组织链核企业、生态伙伴现场展示产品和技术，同步开展需求对接、资源推介，推动圈层活动与产业招引、企业服务有效贯通。</w:t>
       </w:r>
       <w:r/>
     </w:p>
@@ -881,8 +1051,18 @@
           <w:b w:val="0"/>
           <w:color w:val="000000"/>
           <w:sz w:val="32"/>
+          <w:lang w:val="zh-CN"/>
         </w:rPr>
-        <w:t xml:space="preserve">1. 人员保障不足。</w:t>
+        <w:t xml:space="preserve">1</w:t>
+      </w:r>
+      <w:r>
+        <w:rPr>
+          <w:rFonts w:hint="eastAsia" w:ascii="楷体_GB2312" w:hAnsi="楷体_GB2312" w:eastAsia="楷体_GB2312" w:cs="楷体_GB2312"/>
+          <w:b w:val="0"/>
+          <w:color w:val="000000"/>
+          <w:sz w:val="32"/>
+        </w:rPr>
+        <w:t xml:space="preserve">. 专项经费未纳入年度预算。</w:t>
       </w:r>
       <w:r>
         <w:rPr>
@@ -902,7 +1082,7 @@
         <w:rPr>
           <w:rFonts w:hint="eastAsia"/>
         </w:rPr>
-        <w:t xml:space="preserve">项目推进需要党务及产业技术专业力量支撑，当前党员发展名额紧张、技术人才较为缺少，现有工作力量与承担任务量存在一定差距。</w:t>
+        <w:t xml:space="preserve">专项预算方案已拟定，但开展圈层活动、企业对接等联建工作产生的相关费用部分不在现有年度预算内，经费保障存在不确定性。</w:t>
       </w:r>
       <w:r/>
     </w:p>
@@ -926,8 +1106,18 @@
           <w:b w:val="0"/>
           <w:color w:val="000000"/>
           <w:sz w:val="32"/>
+          <w:lang w:val="zh-CN"/>
         </w:rPr>
-        <w:t xml:space="preserve">2. 专项经费未纳入年度预算。</w:t>
+        <w:t xml:space="preserve">2</w:t>
+      </w:r>
+      <w:r>
+        <w:rPr>
+          <w:rFonts w:hint="eastAsia" w:ascii="楷体_GB2312" w:hAnsi="楷体_GB2312" w:eastAsia="楷体_GB2312" w:cs="楷体_GB2312"/>
+          <w:b w:val="0"/>
+          <w:color w:val="000000"/>
+          <w:sz w:val="32"/>
+        </w:rPr>
+        <w:t xml:space="preserve">. 外部协调难度大。</w:t>
       </w:r>
       <w:r>
         <w:rPr>
@@ -947,52 +1137,7 @@
         <w:rPr>
           <w:rFonts w:hint="eastAsia"/>
         </w:rPr>
-        <w:t xml:space="preserve">专项预算方案已拟定，但开展圈层活动、企业对接等联建工作产生的相关费用部分不在现有年度预算内，经费保障存在不确定性。</w:t>
-      </w:r>
-      <w:r/>
-    </w:p>
-    <w:p>
-      <w:pPr>
-        <w:keepNext w:val="true"/>
-        <w:keepLines w:val="true"/>
-        <w:pBdr/>
-        <w:spacing w:after="0" w:afterAutospacing="1" w:before="0" w:beforeAutospacing="1" w:line="560" w:lineRule="exact"/>
-        <w:ind w:firstLine="640"/>
-        <w:jc w:val="left"/>
-        <w:outlineLvl w:val="2"/>
-        <w:rPr>
-          <w:sz w:val="32"/>
-          <w:szCs w:val="32"/>
-        </w:rPr>
-      </w:pPr>
-      <w:r>
-        <w:rPr>
-          <w:rFonts w:hint="eastAsia" w:ascii="楷体_GB2312" w:hAnsi="楷体_GB2312" w:eastAsia="楷体_GB2312" w:cs="楷体_GB2312"/>
-          <w:b w:val="0"/>
-          <w:color w:val="000000"/>
-          <w:sz w:val="32"/>
-        </w:rPr>
-        <w:t xml:space="preserve">3. 外部协调难度大。</w:t>
-      </w:r>
-      <w:r>
-        <w:rPr>
-          <w:sz w:val="32"/>
-          <w:szCs w:val="32"/>
-        </w:rPr>
-      </w:r>
-    </w:p>
-    <w:p>
-      <w:pPr>
-        <w:pBdr/>
-        <w:spacing/>
-        <w:ind/>
-        <w:rPr/>
-      </w:pPr>
-      <w:r>
-        <w:rPr>
-          <w:rFonts w:hint="eastAsia"/>
-        </w:rPr>
-        <w:t xml:space="preserve">联建涉及滨江物联网小镇党委、滨江行政服务中心党总支等多家属地外部单位，支部层级统筹推动力度有限，资源调配与事项协调效率有待提升。</w:t>
+        <w:t xml:space="preserve">联建涉及滨江物联网小镇党委、滨江行政服务中心党总支等多家外部单位，支部层级统筹推动力度有限，资源调配与事项协调效率有待提升。</w:t>
       </w:r>
       <w:r/>
     </w:p>
@@ -1114,6 +1259,26 @@
         </w:rPr>
         <w:t xml:space="preserve">梳理完善《资源清单》《需求清单》；10月中旬组织企业产品推介会，推动链核企业与生态伙伴深度对接。</w:t>
       </w:r>
+      <w:r>
+        <w:rPr>
+          <w:rFonts w:hint="eastAsia"/>
+        </w:rPr>
+        <w:t xml:space="preserve">以活动聚人气、以圈层促发展。</w:t>
+      </w:r>
+      <w:r/>
+      <w:r>
+        <w:rPr>
+          <w:rFonts w:hint="eastAsia"/>
+        </w:rPr>
+      </w:r>
+      <w:r/>
+      <w:r>
+        <w:rPr>
+          <w:rFonts w:hint="eastAsia"/>
+        </w:rPr>
+        <w:t xml:space="preserve">力争年内引入产业链目标企业1家；</w:t>
+      </w:r>
+      <w:r/>
       <w:r/>
     </w:p>
     <w:p>
@@ -1208,48 +1373,60 @@
     </w:p>
     <w:p>
       <w:pPr>
-        <w:keepNext w:val="true"/>
-        <w:keepLines w:val="true"/>
-        <w:pBdr/>
-        <w:spacing w:after="0" w:afterAutospacing="1" w:before="0" w:beforeAutospacing="1" w:line="560" w:lineRule="exact"/>
-        <w:ind w:firstLine="640"/>
-        <w:jc w:val="left"/>
-        <w:outlineLvl w:val="2"/>
-        <w:rPr>
-          <w:sz w:val="32"/>
-          <w:szCs w:val="32"/>
-        </w:rPr>
+        <w:pBdr/>
+        <w:spacing w:after="0" w:before="0" w:line="560" w:lineRule="exact"/>
+        <w:ind w:firstLine="0"/>
+        <w:jc w:val="right"/>
+        <w:rPr/>
       </w:pPr>
       <w:r>
         <w:rPr>
-          <w:rFonts w:hint="eastAsia" w:ascii="楷体_GB2312" w:hAnsi="楷体_GB2312" w:eastAsia="楷体_GB2312" w:cs="楷体_GB2312"/>
-          <w:b w:val="0"/>
-          <w:color w:val="000000"/>
-          <w:sz w:val="32"/>
+          <w:rFonts w:hint="eastAsia"/>
+          <w:highlight w:val="none"/>
         </w:rPr>
-        <w:t xml:space="preserve">5. 常态化推进，持续深化圈层联动与品牌塑造。</w:t>
       </w:r>
       <w:r>
         <w:rPr>
-          <w:sz w:val="32"/>
-          <w:szCs w:val="32"/>
+          <w:rFonts w:hint="eastAsia"/>
+          <w:highlight w:val="none"/>
+        </w:rPr>
+      </w:r>
+      <w:r>
+        <w:rPr>
+          <w:rFonts w:hint="eastAsia"/>
+          <w:highlight w:val="none"/>
         </w:rPr>
       </w:r>
     </w:p>
     <w:p>
       <w:pPr>
         <w:pBdr/>
-        <w:spacing/>
-        <w:ind/>
-        <w:rPr/>
+        <w:spacing w:after="0" w:before="0" w:line="560" w:lineRule="exact"/>
+        <w:ind w:firstLine="0"/>
+        <w:jc w:val="right"/>
+        <w:rPr>
+          <w:rFonts w:hint="eastAsia"/>
+          <w:highlight w:val="none"/>
+        </w:rPr>
       </w:pPr>
       <w:r>
         <w:rPr>
           <w:rFonts w:hint="eastAsia"/>
+          <w:highlight w:val="none"/>
         </w:rPr>
-        <w:t xml:space="preserve">紧扣年内产业圈层联动活动不少于2场目标，力争年内引入产业链目标企业1家；配合做好10月20日集团党建联建暨产业链对接推进会承办工作，以活动聚人气、以圈层促发展。</w:t>
       </w:r>
-      <w:r/>
+      <w:r>
+        <w:rPr>
+          <w:rFonts w:hint="eastAsia"/>
+          <w:highlight w:val="none"/>
+        </w:rPr>
+      </w:r>
+      <w:r>
+        <w:rPr>
+          <w:rFonts w:hint="eastAsia"/>
+          <w:highlight w:val="none"/>
+        </w:rPr>
+      </w:r>
     </w:p>
     <w:p>
       <w:pPr>
@@ -1257,7 +1434,10 @@
         <w:spacing w:after="0" w:before="0" w:line="560" w:lineRule="exact"/>
         <w:ind w:firstLine="0"/>
         <w:jc w:val="right"/>
-        <w:rPr/>
+        <w:rPr>
+          <w:rFonts w:hint="eastAsia"/>
+          <w:highlight w:val="none"/>
+        </w:rPr>
       </w:pPr>
       <w:r>
         <w:rPr>

</xml_diff>

<commit_message>
vault backup: 2026-09-14 15:48:59
</commit_message>
<xml_diff>
--- a/工作/圈式链式/关于“链上红盟·三联共促”党建联建近期工作推进情况的汇报（提纲）修改版.docx
+++ b/工作/圈式链式/关于“链上红盟·三联共促”党建联建近期工作推进情况的汇报（提纲）修改版.docx
@@ -157,8 +157,6 @@
           <w:szCs w:val="32"/>
         </w:rPr>
       </w:pPr>
-      <w:bookmarkStart w:id="0" w:name="_GoBack"/>
-      <w:bookmarkEnd w:id="0"/>
       <w:r>
         <w:rPr>
           <w:rFonts w:hint="eastAsia" w:ascii="黑体" w:hAnsi="黑体" w:eastAsia="黑体" w:cs="黑体"/>
@@ -273,7 +271,20 @@
         <w:rPr>
           <w:rFonts w:hint="eastAsia"/>
         </w:rPr>
-        <w:t>全面梳理园区楼宇大厅、屋顶花园、道路、停车场等实景资源，形成总面积超1.6万㎡的园区实景资源清单</w:t>
+        <w:t>全面梳理园区楼宇大厅、屋顶花园、道路、停车场等实景资源，形成总面积超</w:t>
+      </w:r>
+      <w:r>
+        <w:rPr>
+          <w:rFonts w:hint="eastAsia"/>
+          <w:color w:val="FF0000"/>
+        </w:rPr>
+        <w:t>1.6万㎡</w:t>
+      </w:r>
+      <w:r>
+        <w:rPr>
+          <w:rFonts w:hint="eastAsia"/>
+        </w:rPr>
+        <w:t>的园区实景资源清单</w:t>
       </w:r>
       <w:r>
         <w:rPr>
@@ -314,7 +325,34 @@
         <w:rPr>
           <w:rFonts w:hint="eastAsia"/>
         </w:rPr>
-        <w:t>防雨走廊，以“小切口”提升园区企业获得感和满意度。</w:t>
+        <w:t>防雨走廊，以“小切口”提升园区企业获得感和满意度</w:t>
+      </w:r>
+      <w:r>
+        <w:rPr>
+          <w:rFonts w:hint="eastAsia"/>
+          <w:lang w:eastAsia="zh-CN"/>
+        </w:rPr>
+        <w:t>（</w:t>
+      </w:r>
+      <w:r>
+        <w:rPr>
+          <w:rFonts w:hint="eastAsia"/>
+          <w:lang w:val="en-US" w:eastAsia="zh-CN"/>
+        </w:rPr>
+        <w:t>附照片</w:t>
+      </w:r>
+      <w:r>
+        <w:rPr>
+          <w:rFonts w:hint="eastAsia"/>
+          <w:lang w:eastAsia="zh-CN"/>
+        </w:rPr>
+        <w:t>）</w:t>
+      </w:r>
+      <w:r>
+        <w:rPr>
+          <w:rFonts w:hint="eastAsia"/>
+        </w:rPr>
+        <w:t>。</w:t>
       </w:r>
     </w:p>
     <w:p>
@@ -534,6 +572,27 @@
       <w:r>
         <w:rPr>
           <w:rFonts w:hint="eastAsia"/>
+          <w:lang w:eastAsia="zh-CN"/>
+        </w:rPr>
+        <w:t>（</w:t>
+      </w:r>
+      <w:r>
+        <w:rPr>
+          <w:rFonts w:hint="eastAsia"/>
+          <w:lang w:val="en-US" w:eastAsia="zh-CN"/>
+        </w:rPr>
+        <w:t>附照片</w:t>
+      </w:r>
+      <w:r>
+        <w:rPr>
+          <w:rFonts w:hint="eastAsia"/>
+          <w:lang w:eastAsia="zh-CN"/>
+        </w:rPr>
+        <w:t>）</w:t>
+      </w:r>
+      <w:r>
+        <w:rPr>
+          <w:rFonts w:hint="eastAsia"/>
           <w:lang w:val="en-US" w:eastAsia="zh-CN"/>
         </w:rPr>
         <w:t>，</w:t>
@@ -602,14 +661,23 @@
           <w:color w:val="FF0000"/>
           <w:lang w:val="zh-CN"/>
         </w:rPr>
-        <w:t>1</w:t>
+        <w:t>（</w:t>
       </w:r>
       <w:r>
         <w:rPr>
           <w:rFonts w:hint="eastAsia"/>
           <w:color w:val="FF0000"/>
+          <w:lang w:val="en-US" w:eastAsia="zh-CN"/>
         </w:rPr>
-        <w:t>场</w:t>
+        <w:t>附件</w:t>
+      </w:r>
+      <w:r>
+        <w:rPr>
+          <w:rFonts w:hint="eastAsia"/>
+          <w:color w:val="FF0000"/>
+          <w:lang w:val="zh-CN"/>
+        </w:rPr>
+        <w:t>）</w:t>
       </w:r>
       <w:r>
         <w:rPr>
@@ -792,6 +860,8 @@
         </w:rPr>
         <w:t>形成补链目标企业名单和针对性服务目录、服务流程、服务内容清单，定制链核企业专属服务包，推动服务供给与企业需求精准衔接。</w:t>
       </w:r>
+      <w:bookmarkStart w:id="0" w:name="_GoBack"/>
+      <w:bookmarkEnd w:id="0"/>
     </w:p>
     <w:p>
       <w:pPr>

</xml_diff>